<commit_message>
Resume: Engineering Intern- AI Agents, Data & RiskOS @ Socure (MNC)
</commit_message>
<xml_diff>
--- a/resumes/Resume_Engineering_Intern-_AI_Agents__Data_Socure__MNC_.docx
+++ b/resumes/Resume_Engineering_Intern-_AI_Agents__Data_Socure__MNC_.docx
@@ -117,7 +117,7 @@
         <w:pBdr>
           <w:bottom w:val="single" w:sz="6" w:space="1" w:color="000000"/>
         </w:pBdr>
-        <w:spacing w:before="85" w:after="0"/>
+        <w:spacing w:before="113" w:after="0"/>
       </w:pPr>
       <w:r>
         <w:rPr>
@@ -289,7 +289,7 @@
     </w:p>
     <w:p>
       <w:pPr>
-        <w:spacing w:before="16" w:after="16"/>
+        <w:spacing w:before="23" w:after="23"/>
       </w:pPr>
     </w:p>
     <w:p>
@@ -297,7 +297,7 @@
         <w:pBdr>
           <w:bottom w:val="single" w:sz="6" w:space="1" w:color="000000"/>
         </w:pBdr>
-        <w:spacing w:before="85" w:after="0"/>
+        <w:spacing w:before="113" w:after="0"/>
       </w:pPr>
       <w:r>
         <w:rPr>
@@ -404,7 +404,7 @@
           <w:ilvl w:val="0"/>
           <w:numId w:val="2"/>
         </w:numPr>
-        <w:spacing w:before="13" w:after="26"/>
+        <w:spacing w:before="13" w:after="32"/>
       </w:pPr>
       <w:r>
         <w:rPr>
@@ -423,7 +423,7 @@
           <w:ilvl w:val="0"/>
           <w:numId w:val="2"/>
         </w:numPr>
-        <w:spacing w:before="13" w:after="26"/>
+        <w:spacing w:before="13" w:after="32"/>
       </w:pPr>
       <w:r>
         <w:rPr>
@@ -442,7 +442,7 @@
           <w:ilvl w:val="0"/>
           <w:numId w:val="2"/>
         </w:numPr>
-        <w:spacing w:before="13" w:after="26"/>
+        <w:spacing w:before="13" w:after="32"/>
       </w:pPr>
       <w:r>
         <w:rPr>
@@ -461,7 +461,7 @@
           <w:ilvl w:val="0"/>
           <w:numId w:val="2"/>
         </w:numPr>
-        <w:spacing w:before="13" w:after="26"/>
+        <w:spacing w:before="13" w:after="32"/>
       </w:pPr>
       <w:r>
         <w:rPr>
@@ -475,7 +475,7 @@
     </w:p>
     <w:p>
       <w:pPr>
-        <w:spacing w:before="16" w:after="16"/>
+        <w:spacing w:before="23" w:after="23"/>
         <w:rPr>
           <w:rFonts w:ascii="Source Sans Pro" w:eastAsia="Source Sans Pro" w:hAnsi="Source Sans Pro" w:cs="Source Sans Pro"/>
           <w:b/>
@@ -488,7 +488,7 @@
     </w:p>
     <w:p>
       <w:pPr>
-        <w:spacing w:before="78" w:after="0"/>
+        <w:spacing w:before="106" w:after="0"/>
         <w:rPr>
           <w:rFonts w:ascii="Source Sans Pro" w:eastAsia="Source Sans Pro" w:hAnsi="Source Sans Pro" w:cs="Source Sans Pro"/>
           <w:b/>
@@ -506,13 +506,13 @@
         <mc:AlternateContent>
           <mc:Choice Requires="wps">
             <w:drawing>
-              <wp:anchor distT="0" distB="0" distL="114300" distR="114300" simplePos="0" relativeHeight="251659264" behindDoc="0" locked="0" layoutInCell="1" allowOverlap="1" wp14:anchorId="491819C8" wp14:editId="6BC13A2A">
+              <wp:anchor distT="0" distB="0" distL="114300" distR="114300" simplePos="0" relativeHeight="251659264" behindDoc="0" locked="0" layoutInCell="1" allowOverlap="1" wp14:anchorId="491819C8" wp14:editId="73B92A3A">
                 <wp:simplePos x="0" y="0"/>
                 <wp:positionH relativeFrom="column">
                   <wp:posOffset>0</wp:posOffset>
                 </wp:positionH>
                 <wp:positionV relativeFrom="paragraph">
-                  <wp:posOffset>193463</wp:posOffset>
+                  <wp:posOffset>250402</wp:posOffset>
                 </wp:positionV>
                 <wp:extent cx="6896478" cy="0"/>
                 <wp:effectExtent l="0" t="0" r="12700" b="12700"/>
@@ -531,13 +531,7 @@
                         <a:prstGeom prst="line">
                           <a:avLst/>
                         </a:prstGeom>
-                        <a:ln>
-                          <a:solidFill>
-                            <a:schemeClr val="bg1">
-                              <a:lumMod val="85000"/>
-                            </a:schemeClr>
-                          </a:solidFill>
-                        </a:ln>
+                        <a:ln/>
                       </wps:spPr>
                       <wps:style>
                         <a:lnRef idx="1">
@@ -565,7 +559,7 @@
           </mc:Choice>
           <mc:Fallback>
             <w:pict>
-              <v:line w14:anchorId="7543AEE3" id="Straight Connector 16" o:spid="_x0000_s1026" style="position:absolute;z-index:251659264;visibility:visible;mso-wrap-style:square;mso-width-percent:0;mso-wrap-distance-left:9pt;mso-wrap-distance-top:0;mso-wrap-distance-right:9pt;mso-wrap-distance-bottom:0;mso-position-horizontal:absolute;mso-position-horizontal-relative:text;mso-position-vertical:absolute;mso-position-vertical-relative:text;mso-width-percent:0;mso-width-relative:margin" from="0,15.25pt" to="543.05pt,15.25pt" o:gfxdata="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" strokecolor="#d8d8d8 [2732]" strokeweight="1pt">
+              <v:line w14:anchorId="283C71F3" id="Straight Connector 16" o:spid="_x0000_s1026" style="position:absolute;z-index:251659264;visibility:visible;mso-wrap-style:square;mso-width-percent:0;mso-wrap-distance-left:9pt;mso-wrap-distance-top:0;mso-wrap-distance-right:9pt;mso-wrap-distance-bottom:0;mso-position-horizontal:absolute;mso-position-horizontal-relative:text;mso-position-vertical:absolute;mso-position-vertical-relative:text;mso-width-percent:0;mso-width-relative:margin" from="0,19.7pt" to="543.05pt,19.7pt" o:gfxdata="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" strokecolor="black [3200]" strokeweight="1pt">
                 <v:stroke joinstyle="miter"/>
               </v:line>
             </w:pict>
@@ -625,6 +619,39 @@
           </w:rPr>
           <w:t/>
         </w:r>
+        <w:r>
+          <w:rPr>
+            <w:rFonts w:ascii="Source Sans Pro" w:eastAsia="Source Sans Pro" w:hAnsi="Source Sans Pro" w:cs="Source Sans Pro"/>
+            <w:b/>
+            <w:color w:val="000000"/>
+            <w:sz w:val="19"/>
+            <w:szCs w:val="19"/>
+            <w:u w:val="single"/>
+          </w:rPr>
+          <w:t/>
+        </w:r>
+        <w:r>
+          <w:rPr>
+            <w:rFonts w:ascii="Source Sans Pro" w:eastAsia="Source Sans Pro" w:hAnsi="Source Sans Pro" w:cs="Source Sans Pro"/>
+            <w:b/>
+            <w:color w:val="000000"/>
+            <w:sz w:val="19"/>
+            <w:szCs w:val="19"/>
+            <w:u w:val="single"/>
+          </w:rPr>
+          <w:t/>
+        </w:r>
+        <w:r>
+          <w:rPr>
+            <w:rFonts w:ascii="Source Sans Pro" w:eastAsia="Source Sans Pro" w:hAnsi="Source Sans Pro" w:cs="Source Sans Pro"/>
+            <w:b/>
+            <w:color w:val="000000"/>
+            <w:sz w:val="19"/>
+            <w:szCs w:val="19"/>
+            <w:u w:val="single"/>
+          </w:rPr>
+          <w:t/>
+        </w:r>
       </w:hyperlink>
       <w:r>
         <w:rPr>
@@ -659,16 +686,16 @@
           <w:ilvl w:val="0"/>
           <w:numId w:val="2"/>
         </w:numPr>
-        <w:spacing w:before="13" w:after="26"/>
-      </w:pPr>
-      <w:r>
-        <w:rPr>
-          <w:rFonts w:ascii="Source Sans Pro" w:eastAsia="Source Sans Pro" w:hAnsi="Source Sans Pro" w:cs="Source Sans Pro"/>
-          <w:color w:val="000000"/>
-          <w:sz w:val="19"/>
-          <w:szCs w:val="19"/>
-        </w:rPr>
-        <w:t>Developed multi-source risk assessment pipeline: submits vendor domains and IPs to VirusTotal, AbuseIPDB, and URLScan.io, cross-referencing WHOIS, DNS, and SSL certificate data for third-party due diligence and threat intelligence.</w:t>
+        <w:spacing w:before="13" w:after="32"/>
+      </w:pPr>
+      <w:r>
+        <w:rPr>
+          <w:rFonts w:ascii="Source Sans Pro" w:eastAsia="Source Sans Pro" w:hAnsi="Source Sans Pro" w:cs="Source Sans Pro"/>
+          <w:color w:val="000000"/>
+          <w:sz w:val="19"/>
+          <w:szCs w:val="19"/>
+        </w:rPr>
+        <w:t>Developed multi-source risk assessment pipeline: submits vendor domains and IPs to VirusTotal, AbuseIPDB, and URLScan.io, cross-referencing WHOIS, DNS, and SSL certificate details for due diligence.</w:t>
       </w:r>
     </w:p>
     <w:p>
@@ -678,7 +705,7 @@
           <w:ilvl w:val="0"/>
           <w:numId w:val="2"/>
         </w:numPr>
-        <w:spacing w:before="13" w:after="26"/>
+        <w:spacing w:before="13" w:after="32"/>
       </w:pPr>
       <w:r>
         <w:rPr>
@@ -697,7 +724,7 @@
           <w:ilvl w:val="0"/>
           <w:numId w:val="2"/>
         </w:numPr>
-        <w:spacing w:before="13" w:after="26"/>
+        <w:spacing w:before="13" w:after="32"/>
       </w:pPr>
       <w:r>
         <w:rPr>
@@ -711,7 +738,7 @@
     </w:p>
     <w:p>
       <w:pPr>
-        <w:spacing w:before="16" w:after="16"/>
+        <w:spacing w:before="23" w:after="23"/>
       </w:pPr>
     </w:p>
     <w:p>
@@ -767,16 +794,16 @@
           <w:ilvl w:val="0"/>
           <w:numId w:val="2"/>
         </w:numPr>
-        <w:spacing w:before="13" w:after="26"/>
-      </w:pPr>
-      <w:r>
-        <w:rPr>
-          <w:rFonts w:ascii="Source Sans Pro" w:eastAsia="Source Sans Pro" w:hAnsi="Source Sans Pro" w:cs="Source Sans Pro"/>
-          <w:color w:val="000000"/>
-          <w:sz w:val="19"/>
-          <w:szCs w:val="19"/>
-        </w:rPr>
-        <w:t>Developed automated vulnerability assessment pipeline integrating Nessus and OpenVAS APIs in Python, generating audit-ready CVE reports with EPSS context from FIRST.org API and CVSS severity classification.</w:t>
+        <w:spacing w:before="13" w:after="32"/>
+      </w:pPr>
+      <w:r>
+        <w:rPr>
+          <w:rFonts w:ascii="Source Sans Pro" w:eastAsia="Source Sans Pro" w:hAnsi="Source Sans Pro" w:cs="Source Sans Pro"/>
+          <w:color w:val="000000"/>
+          <w:sz w:val="19"/>
+          <w:szCs w:val="19"/>
+        </w:rPr>
+        <w:t>Developed automated vulnerability assessment pipeline in Python, integrating Nessus and OpenVAS APIs, and generating audit-ready CVE reports with EPSS context from FIRST.org API.</w:t>
       </w:r>
     </w:p>
     <w:p>
@@ -786,16 +813,16 @@
           <w:ilvl w:val="0"/>
           <w:numId w:val="2"/>
         </w:numPr>
-        <w:spacing w:before="13" w:after="26"/>
-      </w:pPr>
-      <w:r>
-        <w:rPr>
-          <w:rFonts w:ascii="Source Sans Pro" w:eastAsia="Source Sans Pro" w:hAnsi="Source Sans Pro" w:cs="Source Sans Pro"/>
-          <w:color w:val="000000"/>
-          <w:sz w:val="19"/>
-          <w:szCs w:val="19"/>
-        </w:rPr>
-        <w:t>Developed OWASP Top 10 automated compliance checker validating web app security controls against regulatory requirements, documenting vulnerability-to-remediation audit trails with SQL injection fixes.</w:t>
+        <w:spacing w:before="13" w:after="32"/>
+      </w:pPr>
+      <w:r>
+        <w:rPr>
+          <w:rFonts w:ascii="Source Sans Pro" w:eastAsia="Source Sans Pro" w:hAnsi="Source Sans Pro" w:cs="Source Sans Pro"/>
+          <w:color w:val="000000"/>
+          <w:sz w:val="19"/>
+          <w:szCs w:val="19"/>
+        </w:rPr>
+        <w:t>Developed OWASP Top 10 automated compliance checker validating web app security controls against regulatory requirements, documenting vulnerability-to-remediation audit trails.</w:t>
       </w:r>
     </w:p>
     <w:p>
@@ -805,7 +832,7 @@
           <w:ilvl w:val="0"/>
           <w:numId w:val="2"/>
         </w:numPr>
-        <w:spacing w:before="13" w:after="26"/>
+        <w:spacing w:before="13" w:after="32"/>
       </w:pPr>
       <w:r>
         <w:rPr>
@@ -820,7 +847,7 @@
     <w:p>
       <w:pPr>
         <w:pStyle w:val="ListParagraph"/>
-        <w:spacing w:before="16" w:after="16"/>
+        <w:spacing w:before="23" w:after="23"/>
         <w:ind w:left="450"/>
       </w:pPr>
     </w:p>
@@ -829,7 +856,7 @@
         <w:pBdr>
           <w:bottom w:val="single" w:sz="6" w:space="1" w:color="000000"/>
         </w:pBdr>
-        <w:spacing w:before="85" w:after="0"/>
+        <w:spacing w:before="113" w:after="0"/>
       </w:pPr>
       <w:r>
         <w:rPr>
@@ -845,7 +872,7 @@
     </w:p>
     <w:p>
       <w:pPr>
-        <w:spacing w:before="40" w:after="40"/>
+        <w:spacing w:before="47" w:after="47"/>
       </w:pPr>
       <w:r>
         <w:rPr>
@@ -867,7 +894,7 @@
     </w:p>
     <w:p>
       <w:pPr>
-        <w:spacing w:before="40" w:after="40"/>
+        <w:spacing w:before="47" w:after="47"/>
       </w:pPr>
       <w:r>
         <w:rPr>
@@ -889,7 +916,7 @@
     </w:p>
     <w:p>
       <w:pPr>
-        <w:spacing w:before="40" w:after="40"/>
+        <w:spacing w:before="47" w:after="47"/>
       </w:pPr>
       <w:r>
         <w:rPr>
@@ -911,7 +938,7 @@
     </w:p>
     <w:p>
       <w:pPr>
-        <w:spacing w:before="40" w:after="40"/>
+        <w:spacing w:before="47" w:after="47"/>
       </w:pPr>
       <w:r>
         <w:rPr>
@@ -933,7 +960,7 @@
     </w:p>
     <w:p>
       <w:pPr>
-        <w:spacing w:before="40" w:after="29"/>
+        <w:spacing w:before="47" w:after="36"/>
       </w:pPr>
       <w:r>
         <w:rPr>
@@ -958,7 +985,7 @@
         <w:pBdr>
           <w:bottom w:val="single" w:sz="6" w:space="1" w:color="000000"/>
         </w:pBdr>
-        <w:spacing w:before="16" w:after="16"/>
+        <w:spacing w:before="23" w:after="23"/>
         <w:rPr>
           <w:rFonts w:ascii="Source Sans Pro" w:eastAsia="Source Sans Pro" w:hAnsi="Source Sans Pro" w:cs="Source Sans Pro"/>
           <w:b/>
@@ -974,7 +1001,7 @@
         <w:pBdr>
           <w:bottom w:val="single" w:sz="6" w:space="1" w:color="000000"/>
         </w:pBdr>
-        <w:spacing w:before="85" w:after="0"/>
+        <w:spacing w:before="113" w:after="0"/>
       </w:pPr>
       <w:r>
         <w:rPr>
@@ -995,7 +1022,7 @@
           <w:ilvl w:val="0"/>
           <w:numId w:val="2"/>
         </w:numPr>
-        <w:spacing w:before="13" w:after="26"/>
+        <w:spacing w:before="13" w:after="32"/>
       </w:pPr>
       <w:r>
         <w:rPr>
@@ -1014,7 +1041,7 @@
           <w:ilvl w:val="0"/>
           <w:numId w:val="2"/>
         </w:numPr>
-        <w:spacing w:before="13" w:after="26"/>
+        <w:spacing w:before="13" w:after="32"/>
       </w:pPr>
       <w:r>
         <w:rPr>

</xml_diff>